<commit_message>
docs done, one small thing left: rising or falling edge?
</commit_message>
<xml_diff>
--- a/DOC/NukElk_User-doc.docx
+++ b/DOC/NukElk_User-doc.docx
@@ -1179,14 +1179,7 @@
         <w:rPr>
           <w:lang w:val="hu-HU"/>
         </w:rPr>
-        <w:t xml:space="preserve">-1 </w:t>
-      </w:r>
-      <w:proofErr w:type="gramStart"/>
-      <w:r>
-        <w:rPr>
-          <w:lang w:val="hu-HU"/>
-        </w:rPr>
-        <w:t xml:space="preserve">&lt; </w:t>
+        <w:t xml:space="preserve">-1 &lt; </w:t>
       </w:r>
       <w:proofErr w:type="spellStart"/>
       <w:r>
@@ -1196,7 +1189,6 @@
         <w:t>num</w:t>
       </w:r>
       <w:proofErr w:type="spellEnd"/>
-      <w:proofErr w:type="gramEnd"/>
       <w:r>
         <w:rPr>
           <w:lang w:val="hu-HU"/>
@@ -1234,14 +1226,7 @@
         <w:rPr>
           <w:lang w:val="hu-HU"/>
         </w:rPr>
-        <w:t xml:space="preserve"> (-1 </w:t>
-      </w:r>
-      <w:proofErr w:type="gramStart"/>
-      <w:r>
-        <w:rPr>
-          <w:lang w:val="hu-HU"/>
-        </w:rPr>
-        <w:t xml:space="preserve">&lt; </w:t>
+        <w:t xml:space="preserve"> (-1 &lt; </w:t>
       </w:r>
       <w:proofErr w:type="spellStart"/>
       <w:r>
@@ -1251,33 +1236,18 @@
         <w:t>num</w:t>
       </w:r>
       <w:proofErr w:type="spellEnd"/>
-      <w:proofErr w:type="gramEnd"/>
-      <w:r>
-        <w:rPr>
-          <w:lang w:val="hu-HU"/>
-        </w:rPr>
-        <w:t xml:space="preserve"> </w:t>
-      </w:r>
-      <w:proofErr w:type="gramStart"/>
-      <w:r>
-        <w:rPr>
-          <w:lang w:val="hu-HU"/>
-        </w:rPr>
-        <w:t xml:space="preserve">&lt; </w:t>
-      </w:r>
-      <w:proofErr w:type="spellStart"/>
-      <w:r>
-        <w:rPr>
-          <w:lang w:val="hu-HU"/>
-        </w:rPr>
-        <w:t>max</w:t>
-      </w:r>
-      <w:proofErr w:type="gramEnd"/>
-      <w:r>
-        <w:rPr>
-          <w:lang w:val="hu-HU"/>
-        </w:rPr>
-        <w:t>_ma_cps</w:t>
+      <w:r>
+        <w:rPr>
+          <w:lang w:val="hu-HU"/>
+        </w:rPr>
+        <w:t xml:space="preserve"> &lt; </w:t>
+      </w:r>
+      <w:proofErr w:type="spellStart"/>
+      <w:r>
+        <w:rPr>
+          <w:lang w:val="hu-HU"/>
+        </w:rPr>
+        <w:t>max_ma_cps</w:t>
       </w:r>
       <w:proofErr w:type="spellEnd"/>
       <w:r>
@@ -1329,42 +1299,21 @@
         <w:rPr>
           <w:lang w:val="hu-HU"/>
         </w:rPr>
-        <w:t xml:space="preserve"> (-1 </w:t>
-      </w:r>
-      <w:proofErr w:type="gramStart"/>
-      <w:r>
-        <w:rPr>
-          <w:lang w:val="hu-HU"/>
-        </w:rPr>
-        <w:t xml:space="preserve">&lt; </w:t>
-      </w:r>
-      <w:proofErr w:type="spellStart"/>
-      <w:r>
-        <w:rPr>
-          <w:lang w:val="hu-HU"/>
-        </w:rPr>
-        <w:t>min</w:t>
-      </w:r>
-      <w:proofErr w:type="gramEnd"/>
-      <w:r>
-        <w:rPr>
-          <w:lang w:val="hu-HU"/>
-        </w:rPr>
-        <w:t>_ma_cps</w:t>
-      </w:r>
-      <w:proofErr w:type="spellEnd"/>
-      <w:r>
-        <w:rPr>
-          <w:lang w:val="hu-HU"/>
-        </w:rPr>
-        <w:t xml:space="preserve"> </w:t>
-      </w:r>
-      <w:proofErr w:type="gramStart"/>
-      <w:r>
-        <w:rPr>
-          <w:lang w:val="hu-HU"/>
-        </w:rPr>
-        <w:t xml:space="preserve">&lt; </w:t>
+        <w:t xml:space="preserve"> (-1 &lt; </w:t>
+      </w:r>
+      <w:proofErr w:type="spellStart"/>
+      <w:r>
+        <w:rPr>
+          <w:lang w:val="hu-HU"/>
+        </w:rPr>
+        <w:t>min_ma_cps</w:t>
+      </w:r>
+      <w:proofErr w:type="spellEnd"/>
+      <w:r>
+        <w:rPr>
+          <w:lang w:val="hu-HU"/>
+        </w:rPr>
+        <w:t xml:space="preserve"> &lt; </w:t>
       </w:r>
       <w:proofErr w:type="spellStart"/>
       <w:r>
@@ -1374,7 +1323,6 @@
         <w:t>num</w:t>
       </w:r>
       <w:proofErr w:type="spellEnd"/>
-      <w:proofErr w:type="gramEnd"/>
       <w:r>
         <w:rPr>
           <w:lang w:val="hu-HU"/>
@@ -1418,14 +1366,7 @@
         <w:rPr>
           <w:lang w:val="hu-HU"/>
         </w:rPr>
-        <w:t xml:space="preserve">(-1 </w:t>
-      </w:r>
-      <w:proofErr w:type="gramStart"/>
-      <w:r>
-        <w:rPr>
-          <w:lang w:val="hu-HU"/>
-        </w:rPr>
-        <w:t xml:space="preserve">&lt; </w:t>
+        <w:t xml:space="preserve">(-1 &lt; </w:t>
       </w:r>
       <w:proofErr w:type="spellStart"/>
       <w:r>
@@ -1435,19 +1376,11 @@
         <w:t>num</w:t>
       </w:r>
       <w:proofErr w:type="spellEnd"/>
-      <w:proofErr w:type="gramEnd"/>
-      <w:r>
-        <w:rPr>
-          <w:lang w:val="hu-HU"/>
-        </w:rPr>
-        <w:t xml:space="preserve"> </w:t>
-      </w:r>
-      <w:proofErr w:type="gramStart"/>
-      <w:r>
-        <w:rPr>
-          <w:lang w:val="hu-HU"/>
-        </w:rPr>
-        <w:t xml:space="preserve">&lt; </w:t>
+      <w:r>
+        <w:rPr>
+          <w:lang w:val="hu-HU"/>
+        </w:rPr>
+        <w:t xml:space="preserve"> &lt; </w:t>
       </w:r>
       <w:r>
         <w:rPr>
@@ -1455,7 +1388,6 @@
         </w:rPr>
         <w:t>1024</w:t>
       </w:r>
-      <w:proofErr w:type="gramEnd"/>
       <w:r>
         <w:rPr>
           <w:lang w:val="hu-HU"/>
@@ -1499,14 +1431,7 @@
         <w:rPr>
           <w:lang w:val="hu-HU"/>
         </w:rPr>
-        <w:t xml:space="preserve">(-1 </w:t>
-      </w:r>
-      <w:proofErr w:type="gramStart"/>
-      <w:r>
-        <w:rPr>
-          <w:lang w:val="hu-HU"/>
-        </w:rPr>
-        <w:t xml:space="preserve">&lt; </w:t>
+        <w:t xml:space="preserve">(-1 &lt; </w:t>
       </w:r>
       <w:proofErr w:type="spellStart"/>
       <w:r>
@@ -1516,19 +1441,11 @@
         <w:t>num</w:t>
       </w:r>
       <w:proofErr w:type="spellEnd"/>
-      <w:proofErr w:type="gramEnd"/>
-      <w:r>
-        <w:rPr>
-          <w:lang w:val="hu-HU"/>
-        </w:rPr>
-        <w:t xml:space="preserve"> </w:t>
-      </w:r>
-      <w:proofErr w:type="gramStart"/>
-      <w:r>
-        <w:rPr>
-          <w:lang w:val="hu-HU"/>
-        </w:rPr>
-        <w:t xml:space="preserve">&lt; </w:t>
+      <w:r>
+        <w:rPr>
+          <w:lang w:val="hu-HU"/>
+        </w:rPr>
+        <w:t xml:space="preserve"> &lt; </w:t>
       </w:r>
       <w:r>
         <w:rPr>
@@ -1542,7 +1459,6 @@
         </w:rPr>
         <w:t>300</w:t>
       </w:r>
-      <w:proofErr w:type="gramEnd"/>
       <w:r>
         <w:rPr>
           <w:lang w:val="hu-HU"/>
@@ -1598,14 +1514,7 @@
         <w:rPr>
           <w:lang w:val="hu-HU"/>
         </w:rPr>
-        <w:t xml:space="preserve"> </w:t>
-      </w:r>
-      <w:proofErr w:type="gramStart"/>
-      <w:r>
-        <w:rPr>
-          <w:lang w:val="hu-HU"/>
-        </w:rPr>
-        <w:t xml:space="preserve">&lt; </w:t>
+        <w:t xml:space="preserve"> &lt; </w:t>
       </w:r>
       <w:proofErr w:type="spellStart"/>
       <w:r>
@@ -1615,19 +1524,11 @@
         <w:t>num</w:t>
       </w:r>
       <w:proofErr w:type="spellEnd"/>
-      <w:proofErr w:type="gramEnd"/>
-      <w:r>
-        <w:rPr>
-          <w:lang w:val="hu-HU"/>
-        </w:rPr>
-        <w:t xml:space="preserve"> </w:t>
-      </w:r>
-      <w:proofErr w:type="gramStart"/>
-      <w:r>
-        <w:rPr>
-          <w:lang w:val="hu-HU"/>
-        </w:rPr>
-        <w:t xml:space="preserve">&lt; </w:t>
+      <w:r>
+        <w:rPr>
+          <w:lang w:val="hu-HU"/>
+        </w:rPr>
+        <w:t xml:space="preserve"> &lt; </w:t>
       </w:r>
       <w:r>
         <w:rPr>
@@ -1635,7 +1536,6 @@
         </w:rPr>
         <w:t>21</w:t>
       </w:r>
-      <w:proofErr w:type="gramEnd"/>
       <w:r>
         <w:rPr>
           <w:lang w:val="hu-HU"/>
@@ -1687,14 +1587,7 @@
         <w:rPr>
           <w:lang w:val="hu-HU"/>
         </w:rPr>
-        <w:t xml:space="preserve"> (-1 </w:t>
-      </w:r>
-      <w:proofErr w:type="gramStart"/>
-      <w:r>
-        <w:rPr>
-          <w:lang w:val="hu-HU"/>
-        </w:rPr>
-        <w:t xml:space="preserve">&lt; </w:t>
+        <w:t xml:space="preserve"> (-1 &lt; </w:t>
       </w:r>
       <w:proofErr w:type="spellStart"/>
       <w:r>
@@ -1704,19 +1597,11 @@
         <w:t>num</w:t>
       </w:r>
       <w:proofErr w:type="spellEnd"/>
-      <w:proofErr w:type="gramEnd"/>
-      <w:r>
-        <w:rPr>
-          <w:lang w:val="hu-HU"/>
-        </w:rPr>
-        <w:t xml:space="preserve"> </w:t>
-      </w:r>
-      <w:proofErr w:type="gramStart"/>
-      <w:r>
-        <w:rPr>
-          <w:lang w:val="hu-HU"/>
-        </w:rPr>
-        <w:t xml:space="preserve">&lt; </w:t>
+      <w:r>
+        <w:rPr>
+          <w:lang w:val="hu-HU"/>
+        </w:rPr>
+        <w:t xml:space="preserve"> &lt; </w:t>
       </w:r>
       <w:r>
         <w:rPr>
@@ -1730,7 +1615,6 @@
         </w:rPr>
         <w:t>300</w:t>
       </w:r>
-      <w:proofErr w:type="gramEnd"/>
       <w:r>
         <w:rPr>
           <w:lang w:val="hu-HU"/>
@@ -1792,14 +1676,7 @@
         <w:rPr>
           <w:lang w:val="hu-HU"/>
         </w:rPr>
-        <w:t xml:space="preserve"> (-1 </w:t>
-      </w:r>
-      <w:proofErr w:type="gramStart"/>
-      <w:r>
-        <w:rPr>
-          <w:lang w:val="hu-HU"/>
-        </w:rPr>
-        <w:t xml:space="preserve">&lt; </w:t>
+        <w:t xml:space="preserve"> (-1 &lt; </w:t>
       </w:r>
       <w:proofErr w:type="spellStart"/>
       <w:r>
@@ -1809,19 +1686,11 @@
         <w:t>num</w:t>
       </w:r>
       <w:proofErr w:type="spellEnd"/>
-      <w:proofErr w:type="gramEnd"/>
-      <w:r>
-        <w:rPr>
-          <w:lang w:val="hu-HU"/>
-        </w:rPr>
-        <w:t xml:space="preserve"> </w:t>
-      </w:r>
-      <w:proofErr w:type="gramStart"/>
-      <w:r>
-        <w:rPr>
-          <w:lang w:val="hu-HU"/>
-        </w:rPr>
-        <w:t xml:space="preserve">&lt; </w:t>
+      <w:r>
+        <w:rPr>
+          <w:lang w:val="hu-HU"/>
+        </w:rPr>
+        <w:t xml:space="preserve"> &lt; </w:t>
       </w:r>
       <w:r>
         <w:rPr>
@@ -1829,7 +1698,6 @@
         </w:rPr>
         <w:t>1024</w:t>
       </w:r>
-      <w:proofErr w:type="gramEnd"/>
       <w:r>
         <w:rPr>
           <w:lang w:val="hu-HU"/>
@@ -1867,14 +1735,7 @@
         <w:rPr>
           <w:lang w:val="hu-HU"/>
         </w:rPr>
-        <w:t xml:space="preserve"> (-1 </w:t>
-      </w:r>
-      <w:proofErr w:type="gramStart"/>
-      <w:r>
-        <w:rPr>
-          <w:lang w:val="hu-HU"/>
-        </w:rPr>
-        <w:t xml:space="preserve">&lt; </w:t>
+        <w:t xml:space="preserve"> (-1 &lt; </w:t>
       </w:r>
       <w:proofErr w:type="spellStart"/>
       <w:r>
@@ -1884,7 +1745,6 @@
         <w:t>num</w:t>
       </w:r>
       <w:proofErr w:type="spellEnd"/>
-      <w:proofErr w:type="gramEnd"/>
       <w:r>
         <w:rPr>
           <w:lang w:val="hu-HU"/>
@@ -1936,6 +1796,18 @@
         <w:rPr>
           <w:lang w:val="hu-HU"/>
         </w:rPr>
+        <w:t>Lépések:</w:t>
+      </w:r>
+      <w:r>
+        <w:rPr>
+          <w:lang w:val="hu-HU"/>
+        </w:rPr>
+        <w:br/>
+      </w:r>
+      <w:r>
+        <w:rPr>
+          <w:lang w:val="hu-HU"/>
+        </w:rPr>
         <w:t>t</w:t>
       </w:r>
       <w:r>
@@ -2047,6 +1919,278 @@
           <w:lang w:val="hu-HU"/>
         </w:rPr>
         <w:t xml:space="preserve"> USART lecsatlakozás</w:t>
+      </w:r>
+    </w:p>
+    <w:p>
+      <w:pPr>
+        <w:ind w:left="284"/>
+        <w:rPr>
+          <w:lang w:val="hu-HU"/>
+        </w:rPr>
+      </w:pPr>
+      <w:r>
+        <w:rPr>
+          <w:lang w:val="hu-HU"/>
+        </w:rPr>
+        <w:t>Kiadandó paransok</w:t>
+      </w:r>
+      <w:r>
+        <w:rPr>
+          <w:lang w:val="hu-HU"/>
+        </w:rPr>
+        <w:t>:</w:t>
+      </w:r>
+      <w:r>
+        <w:rPr>
+          <w:lang w:val="hu-HU"/>
+        </w:rPr>
+        <w:br/>
+      </w:r>
+      <w:proofErr w:type="spellStart"/>
+      <w:r>
+        <w:rPr>
+          <w:lang w:val="hu-HU"/>
+        </w:rPr>
+        <w:t>usb</w:t>
+      </w:r>
+      <w:proofErr w:type="spellEnd"/>
+      <w:r>
+        <w:rPr>
+          <w:lang w:val="hu-HU"/>
+        </w:rPr>
+        <w:t xml:space="preserve"> csatlakoztatása </w:t>
+      </w:r>
+      <w:r>
+        <w:rPr>
+          <w:lang w:val="hu-HU"/>
+        </w:rPr>
+        <w:sym w:font="Wingdings" w:char="F0E0"/>
+      </w:r>
+      <w:r>
+        <w:rPr>
+          <w:lang w:val="hu-HU"/>
+        </w:rPr>
+        <w:t xml:space="preserve"> login</w:t>
+      </w:r>
+      <w:r>
+        <w:rPr>
+          <w:lang w:val="hu-HU"/>
+        </w:rPr>
+        <w:t xml:space="preserve"> </w:t>
+      </w:r>
+      <w:r>
+        <w:rPr>
+          <w:lang w:val="hu-HU"/>
+        </w:rPr>
+        <w:sym w:font="Wingdings" w:char="F0E0"/>
+      </w:r>
+      <w:r>
+        <w:rPr>
+          <w:lang w:val="hu-HU"/>
+        </w:rPr>
+        <w:t xml:space="preserve"> </w:t>
+      </w:r>
+      <w:proofErr w:type="spellStart"/>
+      <w:r>
+        <w:rPr>
+          <w:lang w:val="hu-HU"/>
+        </w:rPr>
+        <w:t>modify</w:t>
+      </w:r>
+      <w:proofErr w:type="spellEnd"/>
+      <w:r>
+        <w:rPr>
+          <w:lang w:val="hu-HU"/>
+        </w:rPr>
+        <w:t xml:space="preserve"> </w:t>
+      </w:r>
+      <w:proofErr w:type="spellStart"/>
+      <w:r>
+        <w:rPr>
+          <w:lang w:val="hu-HU"/>
+        </w:rPr>
+        <w:t>min_ma_cps</w:t>
+      </w:r>
+      <w:proofErr w:type="spellEnd"/>
+      <w:r>
+        <w:rPr>
+          <w:lang w:val="hu-HU"/>
+        </w:rPr>
+        <w:t xml:space="preserve"> </w:t>
+      </w:r>
+      <w:r>
+        <w:rPr>
+          <w:lang w:val="hu-HU"/>
+        </w:rPr>
+        <w:t xml:space="preserve">5 ENTER </w:t>
+      </w:r>
+      <w:proofErr w:type="spellStart"/>
+      <w:r>
+        <w:rPr>
+          <w:lang w:val="hu-HU"/>
+        </w:rPr>
+        <w:t>modify</w:t>
+      </w:r>
+      <w:proofErr w:type="spellEnd"/>
+      <w:r>
+        <w:rPr>
+          <w:lang w:val="hu-HU"/>
+        </w:rPr>
+        <w:t xml:space="preserve"> </w:t>
+      </w:r>
+      <w:proofErr w:type="spellStart"/>
+      <w:r>
+        <w:rPr>
+          <w:lang w:val="hu-HU"/>
+        </w:rPr>
+        <w:t>max_ma_cps</w:t>
+      </w:r>
+      <w:proofErr w:type="spellEnd"/>
+      <w:r>
+        <w:rPr>
+          <w:lang w:val="hu-HU"/>
+        </w:rPr>
+        <w:t xml:space="preserve"> 1029 </w:t>
+      </w:r>
+      <w:r>
+        <w:rPr>
+          <w:lang w:val="hu-HU"/>
+        </w:rPr>
+        <w:sym w:font="Wingdings" w:char="F0E0"/>
+      </w:r>
+      <w:r>
+        <w:rPr>
+          <w:lang w:val="hu-HU"/>
+        </w:rPr>
+        <w:br/>
+      </w:r>
+      <w:proofErr w:type="spellStart"/>
+      <w:r>
+        <w:rPr>
+          <w:lang w:val="hu-HU"/>
+        </w:rPr>
+        <w:t>modify</w:t>
+      </w:r>
+      <w:proofErr w:type="spellEnd"/>
+      <w:r>
+        <w:rPr>
+          <w:lang w:val="hu-HU"/>
+        </w:rPr>
+        <w:t xml:space="preserve"> </w:t>
+      </w:r>
+      <w:proofErr w:type="spellStart"/>
+      <w:r>
+        <w:rPr>
+          <w:lang w:val="hu-HU"/>
+        </w:rPr>
+        <w:t>min_offset</w:t>
+      </w:r>
+      <w:proofErr w:type="spellEnd"/>
+      <w:r>
+        <w:rPr>
+          <w:lang w:val="hu-HU"/>
+        </w:rPr>
+        <w:t xml:space="preserve"> 0020 </w:t>
+      </w:r>
+      <w:r>
+        <w:rPr>
+          <w:lang w:val="hu-HU"/>
+        </w:rPr>
+        <w:sym w:font="Wingdings" w:char="F0E0"/>
+      </w:r>
+      <w:r>
+        <w:rPr>
+          <w:lang w:val="hu-HU"/>
+        </w:rPr>
+        <w:t xml:space="preserve"> </w:t>
+      </w:r>
+      <w:proofErr w:type="spellStart"/>
+      <w:r>
+        <w:rPr>
+          <w:lang w:val="hu-HU"/>
+        </w:rPr>
+        <w:t>modify</w:t>
+      </w:r>
+      <w:proofErr w:type="spellEnd"/>
+      <w:r>
+        <w:rPr>
+          <w:lang w:val="hu-HU"/>
+        </w:rPr>
+        <w:t xml:space="preserve"> </w:t>
+      </w:r>
+      <w:proofErr w:type="spellStart"/>
+      <w:r>
+        <w:rPr>
+          <w:lang w:val="hu-HU"/>
+        </w:rPr>
+        <w:t>siren_cps</w:t>
+      </w:r>
+      <w:proofErr w:type="spellEnd"/>
+      <w:r>
+        <w:rPr>
+          <w:lang w:val="hu-HU"/>
+        </w:rPr>
+        <w:t xml:space="preserve"> 50 </w:t>
+      </w:r>
+      <w:r>
+        <w:rPr>
+          <w:lang w:val="hu-HU"/>
+        </w:rPr>
+        <w:sym w:font="Wingdings" w:char="F0E0"/>
+      </w:r>
+      <w:r>
+        <w:rPr>
+          <w:lang w:val="hu-HU"/>
+        </w:rPr>
+        <w:t xml:space="preserve"> </w:t>
+      </w:r>
+      <w:proofErr w:type="spellStart"/>
+      <w:r>
+        <w:rPr>
+          <w:lang w:val="hu-HU"/>
+        </w:rPr>
+        <w:t>enable</w:t>
+      </w:r>
+      <w:proofErr w:type="spellEnd"/>
+      <w:r>
+        <w:rPr>
+          <w:lang w:val="hu-HU"/>
+        </w:rPr>
+        <w:t xml:space="preserve"> </w:t>
+      </w:r>
+      <w:proofErr w:type="spellStart"/>
+      <w:r>
+        <w:rPr>
+          <w:lang w:val="hu-HU"/>
+        </w:rPr>
+        <w:t>cps_in</w:t>
+      </w:r>
+      <w:proofErr w:type="spellEnd"/>
+      <w:r>
+        <w:rPr>
+          <w:lang w:val="hu-HU"/>
+        </w:rPr>
+        <w:t xml:space="preserve"> </w:t>
+      </w:r>
+      <w:r>
+        <w:rPr>
+          <w:lang w:val="hu-HU"/>
+        </w:rPr>
+        <w:sym w:font="Wingdings" w:char="F0E0"/>
+      </w:r>
+      <w:r>
+        <w:rPr>
+          <w:lang w:val="hu-HU"/>
+        </w:rPr>
+        <w:t xml:space="preserve"> logout</w:t>
+      </w:r>
+    </w:p>
+    <w:p>
+      <w:pPr>
+        <w:pStyle w:val="Cmsor3"/>
+      </w:pPr>
+      <w:r>
+        <w:t>Sziréna tesztelése</w:t>
       </w:r>
     </w:p>
     <w:p>
@@ -2057,6 +2201,98 @@
           <w:lang w:val="hu-HU"/>
         </w:rPr>
       </w:pPr>
+      <w:r>
+        <w:rPr>
+          <w:lang w:val="hu-HU"/>
+        </w:rPr>
+        <w:t>Lépések:</w:t>
+      </w:r>
+      <w:r>
+        <w:rPr>
+          <w:lang w:val="hu-HU"/>
+        </w:rPr>
+        <w:br/>
+      </w:r>
+      <w:r>
+        <w:rPr>
+          <w:lang w:val="hu-HU"/>
+        </w:rPr>
+        <w:t xml:space="preserve">táp csatlakoztatása </w:t>
+      </w:r>
+      <w:r>
+        <w:rPr>
+          <w:lang w:val="hu-HU"/>
+        </w:rPr>
+        <w:sym w:font="Wingdings" w:char="F0E0"/>
+      </w:r>
+      <w:r>
+        <w:rPr>
+          <w:lang w:val="hu-HU"/>
+        </w:rPr>
+        <w:t xml:space="preserve"> USART-hoz csatlakozás </w:t>
+      </w:r>
+      <w:r>
+        <w:rPr>
+          <w:lang w:val="hu-HU"/>
+        </w:rPr>
+        <w:sym w:font="Wingdings" w:char="F0E0"/>
+      </w:r>
+      <w:r>
+        <w:rPr>
+          <w:lang w:val="hu-HU"/>
+        </w:rPr>
+        <w:t xml:space="preserve"> </w:t>
+      </w:r>
+      <w:r>
+        <w:rPr>
+          <w:lang w:val="hu-HU"/>
+        </w:rPr>
+        <w:t xml:space="preserve">matematika letiltása </w:t>
+      </w:r>
+      <w:r>
+        <w:rPr>
+          <w:lang w:val="hu-HU"/>
+        </w:rPr>
+        <w:sym w:font="Wingdings" w:char="F0E0"/>
+      </w:r>
+      <w:r>
+        <w:rPr>
+          <w:lang w:val="hu-HU"/>
+        </w:rPr>
+        <w:t xml:space="preserve"> sziréna engedélyezése</w:t>
+      </w:r>
+    </w:p>
+    <w:p>
+      <w:pPr>
+        <w:ind w:left="284"/>
+        <w:rPr>
+          <w:lang w:val="hu-HU"/>
+        </w:rPr>
+      </w:pPr>
+      <w:r>
+        <w:rPr>
+          <w:lang w:val="hu-HU"/>
+        </w:rPr>
+        <w:t>Kiadandó p</w:t>
+      </w:r>
+      <w:r>
+        <w:rPr>
+          <w:lang w:val="hu-HU"/>
+        </w:rPr>
+        <w:t>aransok</w:t>
+      </w:r>
+      <w:r>
+        <w:rPr>
+          <w:lang w:val="hu-HU"/>
+        </w:rPr>
+        <w:t>:</w:t>
+      </w:r>
+      <w:r>
+        <w:rPr>
+          <w:lang w:val="hu-HU"/>
+        </w:rPr>
+        <w:br/>
+      </w:r>
       <w:proofErr w:type="spellStart"/>
       <w:r>
         <w:rPr>
@@ -2081,7 +2317,13 @@
         <w:rPr>
           <w:lang w:val="hu-HU"/>
         </w:rPr>
-        <w:t xml:space="preserve"> login</w:t>
+        <w:t xml:space="preserve"> login </w:t>
+      </w:r>
+      <w:r>
+        <w:rPr>
+          <w:lang w:val="hu-HU"/>
+        </w:rPr>
+        <w:sym w:font="Wingdings" w:char="F0E0"/>
       </w:r>
       <w:r>
         <w:rPr>
@@ -2089,6 +2331,34 @@
         </w:rPr>
         <w:t xml:space="preserve"> </w:t>
       </w:r>
+      <w:proofErr w:type="spellStart"/>
+      <w:r>
+        <w:rPr>
+          <w:lang w:val="hu-HU"/>
+        </w:rPr>
+        <w:t>enable</w:t>
+      </w:r>
+      <w:proofErr w:type="spellEnd"/>
+      <w:r>
+        <w:rPr>
+          <w:lang w:val="hu-HU"/>
+        </w:rPr>
+        <w:t xml:space="preserve"> </w:t>
+      </w:r>
+      <w:proofErr w:type="spellStart"/>
+      <w:r>
+        <w:rPr>
+          <w:lang w:val="hu-HU"/>
+        </w:rPr>
+        <w:t>math</w:t>
+      </w:r>
+      <w:proofErr w:type="spellEnd"/>
+      <w:r>
+        <w:rPr>
+          <w:lang w:val="hu-HU"/>
+        </w:rPr>
+        <w:t xml:space="preserve"> </w:t>
+      </w:r>
       <w:r>
         <w:rPr>
           <w:lang w:val="hu-HU"/>
@@ -2106,160 +2376,6 @@
         <w:rPr>
           <w:lang w:val="hu-HU"/>
         </w:rPr>
-        <w:t>modify</w:t>
-      </w:r>
-      <w:proofErr w:type="spellEnd"/>
-      <w:r>
-        <w:rPr>
-          <w:lang w:val="hu-HU"/>
-        </w:rPr>
-        <w:t xml:space="preserve"> </w:t>
-      </w:r>
-      <w:proofErr w:type="spellStart"/>
-      <w:r>
-        <w:rPr>
-          <w:lang w:val="hu-HU"/>
-        </w:rPr>
-        <w:t>min_ma_cps</w:t>
-      </w:r>
-      <w:proofErr w:type="spellEnd"/>
-      <w:r>
-        <w:rPr>
-          <w:lang w:val="hu-HU"/>
-        </w:rPr>
-        <w:t xml:space="preserve"> </w:t>
-      </w:r>
-      <w:r>
-        <w:rPr>
-          <w:lang w:val="hu-HU"/>
-        </w:rPr>
-        <w:t xml:space="preserve">5 ENTER </w:t>
-      </w:r>
-      <w:proofErr w:type="spellStart"/>
-      <w:r>
-        <w:rPr>
-          <w:lang w:val="hu-HU"/>
-        </w:rPr>
-        <w:t>modify</w:t>
-      </w:r>
-      <w:proofErr w:type="spellEnd"/>
-      <w:r>
-        <w:rPr>
-          <w:lang w:val="hu-HU"/>
-        </w:rPr>
-        <w:t xml:space="preserve"> </w:t>
-      </w:r>
-      <w:proofErr w:type="spellStart"/>
-      <w:r>
-        <w:rPr>
-          <w:lang w:val="hu-HU"/>
-        </w:rPr>
-        <w:t>max_ma_cps</w:t>
-      </w:r>
-      <w:proofErr w:type="spellEnd"/>
-      <w:r>
-        <w:rPr>
-          <w:lang w:val="hu-HU"/>
-        </w:rPr>
-        <w:t xml:space="preserve"> 1029 </w:t>
-      </w:r>
-      <w:r>
-        <w:rPr>
-          <w:lang w:val="hu-HU"/>
-        </w:rPr>
-        <w:sym w:font="Wingdings" w:char="F0E0"/>
-      </w:r>
-      <w:r>
-        <w:rPr>
-          <w:lang w:val="hu-HU"/>
-        </w:rPr>
-        <w:t xml:space="preserve"> </w:t>
-      </w:r>
-      <w:proofErr w:type="spellStart"/>
-      <w:r>
-        <w:rPr>
-          <w:lang w:val="hu-HU"/>
-        </w:rPr>
-        <w:t>modify</w:t>
-      </w:r>
-      <w:proofErr w:type="spellEnd"/>
-      <w:r>
-        <w:rPr>
-          <w:lang w:val="hu-HU"/>
-        </w:rPr>
-        <w:t xml:space="preserve"> </w:t>
-      </w:r>
-      <w:proofErr w:type="spellStart"/>
-      <w:r>
-        <w:rPr>
-          <w:lang w:val="hu-HU"/>
-        </w:rPr>
-        <w:t>min_offset</w:t>
-      </w:r>
-      <w:proofErr w:type="spellEnd"/>
-      <w:r>
-        <w:rPr>
-          <w:lang w:val="hu-HU"/>
-        </w:rPr>
-        <w:t xml:space="preserve"> 0020 </w:t>
-      </w:r>
-      <w:r>
-        <w:rPr>
-          <w:lang w:val="hu-HU"/>
-        </w:rPr>
-        <w:sym w:font="Wingdings" w:char="F0E0"/>
-      </w:r>
-      <w:r>
-        <w:rPr>
-          <w:lang w:val="hu-HU"/>
-        </w:rPr>
-        <w:t xml:space="preserve"> </w:t>
-      </w:r>
-      <w:proofErr w:type="spellStart"/>
-      <w:r>
-        <w:rPr>
-          <w:lang w:val="hu-HU"/>
-        </w:rPr>
-        <w:t>modify</w:t>
-      </w:r>
-      <w:proofErr w:type="spellEnd"/>
-      <w:r>
-        <w:rPr>
-          <w:lang w:val="hu-HU"/>
-        </w:rPr>
-        <w:t xml:space="preserve"> </w:t>
-      </w:r>
-      <w:proofErr w:type="spellStart"/>
-      <w:r>
-        <w:rPr>
-          <w:lang w:val="hu-HU"/>
-        </w:rPr>
-        <w:t>siren_cps</w:t>
-      </w:r>
-      <w:proofErr w:type="spellEnd"/>
-      <w:r>
-        <w:rPr>
-          <w:lang w:val="hu-HU"/>
-        </w:rPr>
-        <w:t xml:space="preserve"> 50 </w:t>
-      </w:r>
-      <w:r>
-        <w:rPr>
-          <w:lang w:val="hu-HU"/>
-        </w:rPr>
-        <w:sym w:font="Wingdings" w:char="F0E0"/>
-      </w:r>
-      <w:r>
-        <w:rPr>
-          <w:lang w:val="hu-HU"/>
-        </w:rPr>
-        <w:t xml:space="preserve"> </w:t>
-      </w:r>
-      <w:proofErr w:type="spellStart"/>
-      <w:r>
-        <w:rPr>
-          <w:lang w:val="hu-HU"/>
-        </w:rPr>
         <w:t>enable</w:t>
       </w:r>
       <w:proofErr w:type="spellEnd"/>
@@ -2267,348 +2383,8 @@
         <w:rPr>
           <w:lang w:val="hu-HU"/>
         </w:rPr>
-        <w:t xml:space="preserve"> </w:t>
-      </w:r>
-      <w:proofErr w:type="spellStart"/>
-      <w:r>
-        <w:rPr>
-          <w:lang w:val="hu-HU"/>
-        </w:rPr>
-        <w:t>cps_in</w:t>
-      </w:r>
-      <w:proofErr w:type="spellEnd"/>
-      <w:r>
-        <w:rPr>
-          <w:lang w:val="hu-HU"/>
-        </w:rPr>
-        <w:t xml:space="preserve"> </w:t>
-      </w:r>
-      <w:r>
-        <w:rPr>
-          <w:lang w:val="hu-HU"/>
-        </w:rPr>
-        <w:sym w:font="Wingdings" w:char="F0E0"/>
-      </w:r>
-      <w:r>
-        <w:rPr>
-          <w:lang w:val="hu-HU"/>
-        </w:rPr>
-        <w:t xml:space="preserve"> logout</w:t>
-      </w:r>
-    </w:p>
-    <w:p>
-      <w:pPr>
-        <w:pStyle w:val="Cmsor3"/>
-      </w:pPr>
-      <w:r>
-        <w:t>Példa üzembe helyezés</w:t>
-      </w:r>
-    </w:p>
-    <w:p>
-      <w:pPr>
-        <w:ind w:left="284"/>
-        <w:jc w:val="both"/>
-        <w:rPr>
-          <w:lang w:val="hu-HU"/>
-        </w:rPr>
-      </w:pPr>
-      <w:r>
-        <w:rPr>
-          <w:lang w:val="hu-HU"/>
-        </w:rPr>
-        <w:t xml:space="preserve">táp csatlakoztatása </w:t>
-      </w:r>
-      <w:r>
-        <w:rPr>
-          <w:lang w:val="hu-HU"/>
-        </w:rPr>
-        <w:sym w:font="Wingdings" w:char="F0E0"/>
-      </w:r>
-      <w:r>
-        <w:rPr>
-          <w:lang w:val="hu-HU"/>
-        </w:rPr>
-        <w:t xml:space="preserve"> USART-hoz csatlakozás </w:t>
-      </w:r>
-      <w:r>
-        <w:rPr>
-          <w:lang w:val="hu-HU"/>
-        </w:rPr>
-        <w:sym w:font="Wingdings" w:char="F0E0"/>
-      </w:r>
-      <w:r>
-        <w:rPr>
-          <w:lang w:val="hu-HU"/>
-        </w:rPr>
-        <w:t xml:space="preserve"> mA kimenet tartományának beállítása 5 és 1029 közé</w:t>
-      </w:r>
-      <w:r>
-        <w:rPr>
-          <w:lang w:val="hu-HU"/>
-        </w:rPr>
-        <w:sym w:font="Wingdings" w:char="F0E0"/>
-      </w:r>
-      <w:r>
-        <w:rPr>
-          <w:lang w:val="hu-HU"/>
-        </w:rPr>
-        <w:t xml:space="preserve"> DAC </w:t>
-      </w:r>
-      <w:proofErr w:type="spellStart"/>
-      <w:r>
-        <w:rPr>
-          <w:lang w:val="hu-HU"/>
-        </w:rPr>
-        <w:t>offset</w:t>
-      </w:r>
-      <w:proofErr w:type="spellEnd"/>
-      <w:r>
-        <w:rPr>
-          <w:lang w:val="hu-HU"/>
-        </w:rPr>
-        <w:t xml:space="preserve"> beállítása, hogy a 4 mA 0.02V legyen </w:t>
-      </w:r>
-      <w:r>
-        <w:rPr>
-          <w:lang w:val="hu-HU"/>
-        </w:rPr>
-        <w:sym w:font="Wingdings" w:char="F0E0"/>
-      </w:r>
-      <w:r>
-        <w:rPr>
-          <w:lang w:val="hu-HU"/>
-        </w:rPr>
-        <w:t xml:space="preserve"> sziréna határának beállítása 50-re </w:t>
-      </w:r>
-      <w:r>
-        <w:rPr>
-          <w:lang w:val="hu-HU"/>
-        </w:rPr>
-        <w:sym w:font="Wingdings" w:char="F0E0"/>
-      </w:r>
-      <w:r>
-        <w:rPr>
-          <w:lang w:val="hu-HU"/>
-        </w:rPr>
-        <w:t xml:space="preserve"> beütésszámláló engedélyezése</w:t>
-      </w:r>
-    </w:p>
-    <w:p>
-      <w:pPr>
-        <w:ind w:left="284"/>
-        <w:jc w:val="both"/>
-        <w:rPr>
-          <w:lang w:val="hu-HU"/>
-        </w:rPr>
-      </w:pPr>
-      <w:proofErr w:type="spellStart"/>
-      <w:r>
-        <w:rPr>
-          <w:lang w:val="hu-HU"/>
-        </w:rPr>
-        <w:t>usb</w:t>
-      </w:r>
-      <w:proofErr w:type="spellEnd"/>
-      <w:r>
-        <w:rPr>
-          <w:lang w:val="hu-HU"/>
-        </w:rPr>
-        <w:t xml:space="preserve"> csatlakoztatása </w:t>
-      </w:r>
-      <w:r>
-        <w:rPr>
-          <w:lang w:val="hu-HU"/>
-        </w:rPr>
-        <w:sym w:font="Wingdings" w:char="F0E0"/>
-      </w:r>
-      <w:r>
-        <w:rPr>
-          <w:lang w:val="hu-HU"/>
-        </w:rPr>
-        <w:t xml:space="preserve"> login </w:t>
-      </w:r>
-      <w:r>
-        <w:rPr>
-          <w:lang w:val="hu-HU"/>
-        </w:rPr>
-        <w:sym w:font="Wingdings" w:char="F0E0"/>
-      </w:r>
-      <w:r>
-        <w:rPr>
-          <w:lang w:val="hu-HU"/>
-        </w:rPr>
-        <w:t xml:space="preserve"> </w:t>
-      </w:r>
-      <w:proofErr w:type="spellStart"/>
-      <w:r>
-        <w:rPr>
-          <w:lang w:val="hu-HU"/>
-        </w:rPr>
-        <w:t>modify</w:t>
-      </w:r>
-      <w:proofErr w:type="spellEnd"/>
-      <w:r>
-        <w:rPr>
-          <w:lang w:val="hu-HU"/>
-        </w:rPr>
-        <w:t xml:space="preserve"> </w:t>
-      </w:r>
-      <w:proofErr w:type="spellStart"/>
-      <w:r>
-        <w:rPr>
-          <w:lang w:val="hu-HU"/>
-        </w:rPr>
-        <w:t>min_ma_cps</w:t>
-      </w:r>
-      <w:proofErr w:type="spellEnd"/>
-      <w:r>
-        <w:rPr>
-          <w:lang w:val="hu-HU"/>
-        </w:rPr>
-        <w:t xml:space="preserve"> 5 ENTER </w:t>
-      </w:r>
-      <w:proofErr w:type="spellStart"/>
-      <w:r>
-        <w:rPr>
-          <w:lang w:val="hu-HU"/>
-        </w:rPr>
-        <w:t>modify</w:t>
-      </w:r>
-      <w:proofErr w:type="spellEnd"/>
-      <w:r>
-        <w:rPr>
-          <w:lang w:val="hu-HU"/>
-        </w:rPr>
-        <w:t xml:space="preserve"> </w:t>
-      </w:r>
-      <w:proofErr w:type="spellStart"/>
-      <w:r>
-        <w:rPr>
-          <w:lang w:val="hu-HU"/>
-        </w:rPr>
-        <w:t>max_ma_cps</w:t>
-      </w:r>
-      <w:proofErr w:type="spellEnd"/>
-      <w:r>
-        <w:rPr>
-          <w:lang w:val="hu-HU"/>
-        </w:rPr>
-        <w:t xml:space="preserve"> 1029 </w:t>
-      </w:r>
-      <w:r>
-        <w:rPr>
-          <w:lang w:val="hu-HU"/>
-        </w:rPr>
-        <w:sym w:font="Wingdings" w:char="F0E0"/>
-      </w:r>
-      <w:r>
-        <w:rPr>
-          <w:lang w:val="hu-HU"/>
-        </w:rPr>
-        <w:t xml:space="preserve"> </w:t>
-      </w:r>
-      <w:proofErr w:type="spellStart"/>
-      <w:r>
-        <w:rPr>
-          <w:lang w:val="hu-HU"/>
-        </w:rPr>
-        <w:t>modify</w:t>
-      </w:r>
-      <w:proofErr w:type="spellEnd"/>
-      <w:r>
-        <w:rPr>
-          <w:lang w:val="hu-HU"/>
-        </w:rPr>
-        <w:t xml:space="preserve"> </w:t>
-      </w:r>
-      <w:proofErr w:type="spellStart"/>
-      <w:r>
-        <w:rPr>
-          <w:lang w:val="hu-HU"/>
-        </w:rPr>
-        <w:t>min_offset</w:t>
-      </w:r>
-      <w:proofErr w:type="spellEnd"/>
-      <w:r>
-        <w:rPr>
-          <w:lang w:val="hu-HU"/>
-        </w:rPr>
-        <w:t xml:space="preserve"> 0020 </w:t>
-      </w:r>
-      <w:r>
-        <w:rPr>
-          <w:lang w:val="hu-HU"/>
-        </w:rPr>
-        <w:sym w:font="Wingdings" w:char="F0E0"/>
-      </w:r>
-      <w:r>
-        <w:rPr>
-          <w:lang w:val="hu-HU"/>
-        </w:rPr>
-        <w:t xml:space="preserve"> </w:t>
-      </w:r>
-      <w:proofErr w:type="spellStart"/>
-      <w:r>
-        <w:rPr>
-          <w:lang w:val="hu-HU"/>
-        </w:rPr>
-        <w:t>modify</w:t>
-      </w:r>
-      <w:proofErr w:type="spellEnd"/>
-      <w:r>
-        <w:rPr>
-          <w:lang w:val="hu-HU"/>
-        </w:rPr>
-        <w:t xml:space="preserve"> </w:t>
-      </w:r>
-      <w:proofErr w:type="spellStart"/>
-      <w:r>
-        <w:rPr>
-          <w:lang w:val="hu-HU"/>
-        </w:rPr>
-        <w:t>siren_cps</w:t>
-      </w:r>
-      <w:proofErr w:type="spellEnd"/>
-      <w:r>
-        <w:rPr>
-          <w:lang w:val="hu-HU"/>
-        </w:rPr>
-        <w:t xml:space="preserve"> 50 </w:t>
-      </w:r>
-      <w:r>
-        <w:rPr>
-          <w:lang w:val="hu-HU"/>
-        </w:rPr>
-        <w:sym w:font="Wingdings" w:char="F0E0"/>
-      </w:r>
-      <w:r>
-        <w:rPr>
-          <w:lang w:val="hu-HU"/>
-        </w:rPr>
-        <w:t xml:space="preserve"> </w:t>
-      </w:r>
-      <w:proofErr w:type="spellStart"/>
-      <w:r>
-        <w:rPr>
-          <w:lang w:val="hu-HU"/>
-        </w:rPr>
-        <w:t>enable</w:t>
-      </w:r>
-      <w:proofErr w:type="spellEnd"/>
-      <w:r>
-        <w:rPr>
-          <w:lang w:val="hu-HU"/>
-        </w:rPr>
-        <w:t xml:space="preserve"> </w:t>
-      </w:r>
-      <w:proofErr w:type="spellStart"/>
-      <w:r>
-        <w:rPr>
-          <w:lang w:val="hu-HU"/>
-        </w:rPr>
-        <w:t>cps_in</w:t>
-      </w:r>
-      <w:proofErr w:type="spellEnd"/>
+        <w:t xml:space="preserve"> siren</w:t>
+      </w:r>
     </w:p>
     <w:sectPr>
       <w:type w:val="continuous"/>

</xml_diff>

<commit_message>
found some typeo-s and a missing statement
</commit_message>
<xml_diff>
--- a/DOC/NukElk_User-doc.docx
+++ b/DOC/NukElk_User-doc.docx
@@ -1932,13 +1932,7 @@
         <w:rPr>
           <w:lang w:val="hu-HU"/>
         </w:rPr>
-        <w:t>Kiadandó paransok</w:t>
-      </w:r>
-      <w:r>
-        <w:rPr>
-          <w:lang w:val="hu-HU"/>
-        </w:rPr>
-        <w:t>:</w:t>
+        <w:t>Kiadandó paransok:</w:t>
       </w:r>
       <w:r>
         <w:rPr>
@@ -2084,6 +2078,12 @@
           <w:lang w:val="hu-HU"/>
         </w:rPr>
         <w:t>min_offset</w:t>
+      </w:r>
+      <w:r>
+        <w:rPr>
+          <w:lang w:val="hu-HU"/>
+        </w:rPr>
+        <w:t>_v</w:t>
       </w:r>
       <w:proofErr w:type="spellEnd"/>
       <w:r>

</xml_diff>